<commit_message>
Rules check vs Azhar handbook; fix blocking items in the 19 Oct upload set
- Remove the editor notes and AI graphical-abstract image after reference [51]
  in the corrected manuscript copy (master untouched).
- Figure 3 v5: m_abs of Rb_perfect 1.13 as in Table 3 (v4 plotted 1.00);
  caption adjusted in the copy.
- Highlights and cover letter updated to the 19 Oct numbers.
- USER_19OCT_FIGFIX now holds the complete upload set with a README;
  RULES_CHECK_2026-10-20.md lists every handbook verdict and suggested fix.

Co-Authored-By: Claude Opus 5.5 <noreply@anthropic.com>
Claude-Session: https://claude.ai/code/session_011m1nWiFCs4xdp8CXy2DSzu
</commit_message>
<xml_diff>
--- a/DFT_paper_revision/USER_19OCT_FIGFIX/2_Manuscript_Fig1-2_fixed.docx
+++ b/DFT_paper_revision/USER_19OCT_FIGFIX/2_Manuscript_Fig1-2_fixed.docx
@@ -7621,7 +7621,7 @@
           <w:i/>
           <w:iCs/>
         </w:rPr>
-        <w:t xml:space="preserve"> reference (PBE+U relaxations with U on Ti-3d only). At the production smearing of 0.01 Ry the Pr cells and the pristine perfect cell converge to non-magnetic solutions; both Rb cells carry one unpaired spin, and Rb_VO shows m</w:t>
+        <w:t xml:space="preserve"> reference (PBE+U relaxations with U on Ti-3d only). At the production smearing of 0.01 Ry the Pr cells and the pristine perfect cell converge to non-magnetic solutions; both Rb cells carry one unpaired spin with m</w:t>
       </w:r>
       <w:r>
         <w:rPr>
@@ -12249,221 +12249,6 @@
         </w:rPr>
         <w:t>71. DOI: 10.1021/jp407736f.</w:t>
       </w:r>
-    </w:p>
-    <w:p>
-      <w:pPr>
-        <w:pStyle w:val="BodyText"/>
-        <w:jc w:val="both"/>
-        <w:rPr>
-          <w:rFonts w:asciiTheme="majorBidi" w:hAnsiTheme="majorBidi" w:cstheme="majorBidi"/>
-        </w:rPr>
-      </w:pPr>
-    </w:p>
-    <w:p>
-      <w:pPr>
-        <w:pStyle w:val="BodyText"/>
-        <w:jc w:val="both"/>
-        <w:rPr>
-          <w:rFonts w:asciiTheme="majorBidi" w:hAnsiTheme="majorBidi" w:cstheme="majorBidi"/>
-        </w:rPr>
-      </w:pPr>
-    </w:p>
-    <w:p>
-      <w:pPr>
-        <w:pStyle w:val="BodyText"/>
-        <w:jc w:val="both"/>
-        <w:rPr>
-          <w:rFonts w:asciiTheme="majorBidi" w:hAnsiTheme="majorBidi" w:cstheme="majorBidi"/>
-        </w:rPr>
-      </w:pPr>
-    </w:p>
-    <w:p>
-      <w:pPr>
-        <w:pStyle w:val="BodyText"/>
-        <w:jc w:val="both"/>
-        <w:rPr>
-          <w:rFonts w:asciiTheme="majorBidi" w:hAnsiTheme="majorBidi" w:cstheme="majorBidi"/>
-        </w:rPr>
-      </w:pPr>
-    </w:p>
-    <w:p>
-      <w:pPr>
-        <w:pStyle w:val="BodyText"/>
-        <w:jc w:val="both"/>
-        <w:rPr>
-          <w:rFonts w:asciiTheme="majorBidi" w:hAnsiTheme="majorBidi" w:cstheme="majorBidi"/>
-        </w:rPr>
-      </w:pPr>
-    </w:p>
-    <w:p>
-      <w:pPr>
-        <w:pStyle w:val="BodyText"/>
-        <w:jc w:val="both"/>
-        <w:rPr>
-          <w:rFonts w:asciiTheme="majorBidi" w:hAnsiTheme="majorBidi" w:cstheme="majorBidi"/>
-        </w:rPr>
-      </w:pPr>
-      <w:r>
-        <w:rPr>
-          <w:rFonts w:asciiTheme="majorBidi" w:hAnsiTheme="majorBidi" w:cstheme="majorBidi"/>
-        </w:rPr>
-        <w:t>%%%%%%%%%%%%%%%%%%%%%%%%%%%%%%%%</w:t>
-      </w:r>
-    </w:p>
-    <w:p>
-      <w:pPr>
-        <w:pStyle w:val="BodyText"/>
-        <w:jc w:val="both"/>
-        <w:rPr>
-          <w:rFonts w:asciiTheme="majorBidi" w:hAnsiTheme="majorBidi" w:cstheme="majorBidi"/>
-        </w:rPr>
-      </w:pPr>
-      <w:r>
-        <w:rPr>
-          <w:rFonts w:asciiTheme="majorBidi" w:hAnsiTheme="majorBidi" w:cstheme="majorBidi"/>
-        </w:rPr>
-        <w:lastRenderedPageBreak/>
-        <w:drawing>
-          <wp:inline distT="0" distB="0" distL="0" distR="0" wp14:anchorId="2EA94C3D" wp14:editId="6F15833D">
-            <wp:extent cx="5943600" cy="3341370"/>
-            <wp:effectExtent l="0" t="0" r="0" b="0"/>
-            <wp:docPr id="1" name="Picture 1"/>
-            <wp:cNvGraphicFramePr>
-              <a:graphicFrameLocks xmlns:a="http://schemas.openxmlformats.org/drawingml/2006/main" noChangeAspect="1"/>
-            </wp:cNvGraphicFramePr>
-            <a:graphic xmlns:a="http://schemas.openxmlformats.org/drawingml/2006/main">
-              <a:graphicData uri="http://schemas.openxmlformats.org/drawingml/2006/picture">
-                <pic:pic xmlns:pic="http://schemas.openxmlformats.org/drawingml/2006/picture">
-                  <pic:nvPicPr>
-                    <pic:cNvPr id="1" name=""/>
-                    <pic:cNvPicPr/>
-                  </pic:nvPicPr>
-                  <pic:blipFill>
-                    <a:blip r:embed="rId11"/>
-                    <a:stretch>
-                      <a:fillRect/>
-                    </a:stretch>
-                  </pic:blipFill>
-                  <pic:spPr>
-                    <a:xfrm>
-                      <a:off x="0" y="0"/>
-                      <a:ext cx="5943600" cy="3341370"/>
-                    </a:xfrm>
-                    <a:prstGeom prst="rect">
-                      <a:avLst/>
-                    </a:prstGeom>
-                  </pic:spPr>
-                </pic:pic>
-              </a:graphicData>
-            </a:graphic>
-          </wp:inline>
-        </w:drawing>
-      </w:r>
-    </w:p>
-    <w:p>
-      <w:pPr>
-        <w:pStyle w:val="BodyText"/>
-        <w:jc w:val="both"/>
-        <w:rPr>
-          <w:rFonts w:asciiTheme="majorBidi" w:hAnsiTheme="majorBidi" w:cstheme="majorBidi"/>
-        </w:rPr>
-      </w:pPr>
-    </w:p>
-    <w:p>
-      <w:pPr>
-        <w:pStyle w:val="BodyText"/>
-        <w:jc w:val="both"/>
-        <w:rPr>
-          <w:rFonts w:asciiTheme="majorBidi" w:hAnsiTheme="majorBidi" w:cstheme="majorBidi"/>
-        </w:rPr>
-      </w:pPr>
-    </w:p>
-    <w:p>
-      <w:pPr>
-        <w:pStyle w:val="BodyText"/>
-        <w:jc w:val="both"/>
-        <w:rPr>
-          <w:rFonts w:asciiTheme="majorBidi" w:hAnsiTheme="majorBidi" w:cstheme="majorBidi"/>
-        </w:rPr>
-      </w:pPr>
-    </w:p>
-    <w:p>
-      <w:pPr>
-        <w:pStyle w:val="NormalWeb"/>
-      </w:pPr>
-      <w:r>
-        <w:t>My recommendation as a scientific editor: the graphical abstract should communicate one central finding immediately — Pr and Rb substitution both lower oxygen-vacancy formation energy, but only Rb makes vacancy formation energetically favorable under the stated reference conditions.</w:t>
-      </w:r>
-    </w:p>
-    <w:p>
-      <w:pPr>
-        <w:pStyle w:val="NormalWeb"/>
-      </w:pPr>
-      <w:r>
-        <w:t>The redesigned version above has a clearer five-step workflow and stronger visual hierarchy. Before journal submission, I would make three final checks:</w:t>
-      </w:r>
-    </w:p>
-    <w:p>
-      <w:pPr>
-        <w:pStyle w:val="NormalWeb"/>
-        <w:numPr>
-          <w:ilvl w:val="0"/>
-          <w:numId w:val="3"/>
-        </w:numPr>
-      </w:pPr>
-      <w:r>
-        <w:t>Verify every numerical value against the DFT calculations, especially the Pr values of +1.29 eV and +0.99 eV.</w:t>
-      </w:r>
-    </w:p>
-    <w:p>
-      <w:pPr>
-        <w:pStyle w:val="NormalWeb"/>
-        <w:numPr>
-          <w:ilvl w:val="0"/>
-          <w:numId w:val="3"/>
-        </w:numPr>
-      </w:pPr>
-      <w:r>
-        <w:t>Clarify the charge bookkeeping and ensure the electron/hole symbols are consistent with the calculated charge states and electronic structure.</w:t>
-      </w:r>
-    </w:p>
-    <w:p>
-      <w:pPr>
-        <w:pStyle w:val="NormalWeb"/>
-        <w:numPr>
-          <w:ilvl w:val="0"/>
-          <w:numId w:val="3"/>
-        </w:numPr>
-      </w:pPr>
-      <w:r>
-        <w:t>Export a publication-ready version at the journal's required dimensions and resolution, preferably as editable vector artwork (PDF/SVG) rather than relying solely on a raster image.</w:t>
-      </w:r>
-    </w:p>
-    <w:p>
-      <w:pPr>
-        <w:pStyle w:val="NormalWeb"/>
-      </w:pPr>
-      <w:r>
-        <w:t>No graphical abstract can guarantee acceptance, and the scientific consistency matters more than visual polish. The strongest next step is to verify the figure against the manuscript's methods and results before submission.</w:t>
-      </w:r>
-    </w:p>
-    <w:p>
-      <w:pPr>
-        <w:pStyle w:val="BodyText"/>
-        <w:jc w:val="both"/>
-        <w:rPr>
-          <w:rFonts w:asciiTheme="majorBidi" w:hAnsiTheme="majorBidi" w:cstheme="majorBidi"/>
-        </w:rPr>
-      </w:pPr>
-    </w:p>
-    <w:p>
-      <w:pPr>
-        <w:pStyle w:val="BodyText"/>
-        <w:jc w:val="both"/>
-        <w:rPr>
-          <w:rFonts w:asciiTheme="majorBidi" w:hAnsiTheme="majorBidi" w:cstheme="majorBidi"/>
-        </w:rPr>
-      </w:pPr>
     </w:p>
     <w:bookmarkEnd w:id="0"/>
     <w:sectPr>

</xml_diff>

<commit_message>
Upload set: apply the agreed safe handbook fixes to the manuscript and SI copies
Figure 4 citation order, research-question sentence, U-dependence limitation,
revision-log wording, keywords, Figure 2 / Table 2 captions, footnote markers.
Masters in USER_MASTER_2026-10-19 unchanged.

Co-Authored-By: Claude Opus 5.5 <noreply@anthropic.com>
Claude-Session: https://claude.ai/code/session_011m1nWiFCs4xdp8CXy2DSzu
</commit_message>
<xml_diff>
--- a/DFT_paper_revision/USER_19OCT_FIGFIX/2_Manuscript_Fig1-2_fixed.docx
+++ b/DFT_paper_revision/USER_19OCT_FIGFIX/2_Manuscript_Fig1-2_fixed.docx
@@ -401,20 +401,20 @@
         <w:rPr>
           <w:rFonts w:asciiTheme="majorBidi" w:hAnsiTheme="majorBidi" w:cstheme="majorBidi"/>
         </w:rPr>
-        <w:t xml:space="preserve"> DFT+U; anatase TiO</w:t>
-      </w:r>
-      <w:r>
-        <w:rPr>
-          <w:rFonts w:asciiTheme="majorBidi" w:hAnsiTheme="majorBidi" w:cstheme="majorBidi"/>
-          <w:vertAlign w:val="subscript"/>
-        </w:rPr>
-        <w:t>2</w:t>
-      </w:r>
-      <w:r>
-        <w:rPr>
-          <w:rFonts w:asciiTheme="majorBidi" w:hAnsiTheme="majorBidi" w:cstheme="majorBidi"/>
-        </w:rPr>
-        <w:t>; oxygen vacancy; aliovalent substitution; hole localisation; electron-transport layer.</w:t>
+        <w:t xml:space="preserve"> first-principles calculations; titanium dioxide; point defects; charge compensation; hole localisation; electron-transport layer.</w:t>
+      </w:r>
+      <w:r>
+        <w:rPr>
+          <w:rFonts w:asciiTheme="majorBidi" w:hAnsiTheme="majorBidi" w:cstheme="majorBidi"/>
+          <w:vertAlign w:val="subscript"/>
+        </w:rPr>
+        <w:t/>
+      </w:r>
+      <w:r>
+        <w:rPr>
+          <w:rFonts w:asciiTheme="majorBidi" w:hAnsiTheme="majorBidi" w:cstheme="majorBidi"/>
+        </w:rPr>
+        <w:t/>
       </w:r>
     </w:p>
     <w:p>
@@ -797,7 +797,7 @@
         <w:rPr>
           <w:rFonts w:asciiTheme="majorBidi" w:hAnsiTheme="majorBidi" w:cstheme="majorBidi"/>
         </w:rPr>
-        <w:t>This work provides that bounded comparison. Using one PBE+U protocol we compute the neutral V</w:t>
+        <w:t>This work provides that bounded comparison and asks to what extent, under one protocol, the neutral oxygen-vacancy formation energy of Pr- and Rb-substituted anatase follows the formal charge count of the dopant, and where the dopant-induced holes reside. Using one PBE+U protocol we compute the neutral V</w:t>
       </w:r>
       <w:r>
         <w:rPr>
@@ -2900,7 +2900,7 @@
         <w:rPr>
           <w:rFonts w:asciiTheme="majorBidi" w:hAnsiTheme="majorBidi" w:cstheme="majorBidi"/>
         </w:rPr>
-        <w:t xml:space="preserve"> = U − J = 3.28 eV, with LDA [34]), and it has been used for Er-doped anatase [20] and for anatase (101) defect chemistry [7]; other anatase work uses U = 4.2 eV [13], a value originally fitted for the rutile (110) surface [35], or larger values [14]. Literature U values obtained with other projector schemes are not strictly transferable to the ortho-atomic projectors used here, and the sensitivity of the present results to U is reported in Section 3.7. The DFT+U approach rests on the formulation of Anisimov et al. [36]; linear-response determination of U [37] was not performed for any cell in this work. For the oxygen-site tests of Section 3.4 an additional U</w:t>
+        <w:t xml:space="preserve"> = U − J = 3.28 eV, with LDA [34]), and it has been used for Er-doped anatase [20] and for anatase (101) defect chemistry [7]; other anatase work uses U = 4.2 eV [13], a value originally fitted for the rutile (110) surface [35], or larger values [14]. Literature U values obtained with other projector schemes are not strictly transferable to the ortho-atomic projectors used here, and the sensitivity of the spin states and Fermi energies to U is reported in Section 3.7; the U dependence of the formation energies was not computed (Section 5). The DFT+U approach rests on the formulation of Anisimov et al. [36]; linear-response determination of U [37] was not performed for any cell in this work. For the oxygen-site tests of Section 3.4 an additional U</w:t>
       </w:r>
       <w:r>
         <w:rPr>
@@ -3122,7 +3122,7 @@
         <w:rPr>
           <w:rFonts w:asciiTheme="majorBidi" w:hAnsiTheme="majorBidi" w:cstheme="majorBidi"/>
         </w:rPr>
-        <w:t xml:space="preserve"> Production relaxations used Γ-point sampling; in earlier anatase defect work a Γ-only grid was used only for the hybrid-functional calculations, with denser meshes otherwise [14]. Single-point total energies on the Γ-relaxed geometries were recomputed on a 2×2×2 Monkhorst–Pack mesh for all four doped cells, and the projected densities of states and Löwdin moments were obtained from non-self-consistent calculations on a 2×2×2 mesh (Figure 4; Supporting Information, Section S2); the k-mesh dependence of the formation-energy contrast is reported in Section 3.7. All calculations were spin-polarised (nspin = 2). Fractional occupations were treated with Gaussian smearing. The production relaxations, the production Pristine_perfect single point, the converged pristine-V</w:t>
+        <w:t xml:space="preserve"> Production relaxations used Γ-point sampling; in earlier anatase defect work a Γ-only grid was used only for the hybrid-functional calculations, with denser meshes otherwise [14]. Single-point total energies on the Γ-relaxed geometries were recomputed on a 2×2×2 Monkhorst–Pack mesh for all four doped cells, and the projected densities of states and Löwdin moments were obtained from non-self-consistent calculations on a 2×2×2 mesh (Section 3.6; Supporting Information, Section S2); the k-mesh dependence of the formation-energy contrast is reported in Section 3.7. All calculations were spin-polarised (nspin = 2). Fractional occupations were treated with Gaussian smearing. The production relaxations, the production Pristine_perfect single point, the converged pristine-V</w:t>
       </w:r>
       <w:r>
         <w:rPr>
@@ -3135,7 +3135,7 @@
         <w:rPr>
           <w:rFonts w:asciiTheme="majorBidi" w:hAnsiTheme="majorBidi" w:cstheme="majorBidi"/>
         </w:rPr>
-        <w:t xml:space="preserve"> relaxation (Section S1) and the self-consistent runs that regenerated the densities for the projected densities of states used degauss = 0.01 Ry; all later single points and relaxations (k-mesh series, U sweep, charged cells, dual-U cells, alternative sites, the D3 single points of Pr_VO and Rb_VO, and HSE06) used 0.005 Ry, and the revision runs of Section 2.8(viii) used 0.01 Ry except the smearing tests (Table S10). With smearing, the total energy printed by pw.x is the smearing free energy; the entropy term −TS of each production run is listed under Table S9. For the production cells it is −0.150 eV (Pr_perfect), −0.080 eV (Pr_VO), −0.077 eV (Rb_perfect) and −0.026 eV (Rb_VO), and zero to within 10</w:t>
+        <w:t xml:space="preserve"> relaxation (Section S1) and the self-consistent runs that regenerated the densities for the projected densities of states used degauss = 0.01 Ry; all later single points and relaxations (k-mesh series, U sweep, charged cells, dual-U cells, alternative sites, the D3 single points of Pr_VO and Rb_VO, and HSE06) used 0.005 Ry, and the convergence and robustness runs of Section 2.8(viii) used 0.01 Ry except the smearing tests (Table S10). With smearing, the total energy printed by pw.x is the smearing free energy; the entropy term −TS of each production run is listed under Table S9. For the production cells it is −0.150 eV (Pr_perfect), −0.080 eV (Pr_VO), −0.077 eV (Rb_perfect) and −0.026 eV (Rb_VO), and zero to within 10</w:t>
       </w:r>
       <w:r>
         <w:rPr>
@@ -4563,7 +4563,7 @@
           <w:iCs/>
         </w:rPr>
         <w:lastRenderedPageBreak/>
-        <w:t>(Pr) and −0.14 eV (Rb); the Pr–Rb difference shifts by +0.04 eV. The 2×2×2 Pr_VO and Rb_VO energies are runs of the k-mesh series (Table S2a), which start from scratch and therefore include small offsets from the relaxation endpoints (Section 3.7). Without the smearing entropy the values are +1.22 and −4.11 eV (Section 2.4); at 70 Ry they change by at most 0.03 eV (Section 3.7). With narrower smearing the lowest-energy Pr solutions are spin-polarised, and E</w:t>
+        <w:t>(Pr) and −0.14 eV (Rb); the Pr–Rb difference shifts by +0.04 eV. The 2×2×2 Pr_VO and Rb_VO energies are runs of the k-mesh series (Table S2a), and the 2×2×2 formation-energy cycles are given in Table S2b, which start from scratch and therefore include small offsets from the relaxation endpoints (Section 3.7). Without the smearing entropy the values are +1.22 and −4.11 eV (Section 2.4); at 70 Ry they change by at most 0.03 eV (Section 3.7). With narrower smearing the lowest-energy Pr solutions are spin-polarised, and E</w:t>
       </w:r>
       <w:r>
         <w:rPr>
@@ -4869,7 +4869,14 @@
               <w:rPr>
                 <w:rFonts w:asciiTheme="majorBidi" w:hAnsiTheme="majorBidi" w:cstheme="majorBidi"/>
               </w:rPr>
-              <w:t>−4275.01597 b</w:t>
+              <w:t>−4275.01597</w:t>
+            </w:r>
+            <w:r>
+              <w:rPr>
+                <w:rFonts w:asciiTheme="majorBidi" w:hAnsiTheme="majorBidi" w:cstheme="majorBidi"/>
+                <w:vertAlign w:val="superscript"/>
+              </w:rPr>
+              <w:t xml:space="preserve">b</w:t>
             </w:r>
           </w:p>
         </w:tc>
@@ -5509,7 +5516,7 @@
           <w:i/>
           <w:iCs/>
         </w:rPr>
-        <w:t xml:space="preserve">) for pristine, Pr-substituted and Rb-substituted anatase (PBE+U, U(Ti-3d) = 3.5 eV). Bars: Γ-only relaxed cells (this work; Table 2). Dashed ticks: single-point values at 2×2×2 on the Γ geometries. Both substitutions lower the formation energy relative to pristine; the Pr cell stays </w:t>
+        <w:t xml:space="preserve">) for pristine, Pr-substituted and Rb-substituted anatase (PBE+U, U(Ti-3d) = 3.5 eV). Bars: Γ-only relaxed cells (this work; Table 2). Dashed ticks: single-point values at 2×2×2 on the Γ geometries of the doped cells (pristine: +4.95 eV, Table 2). Both substitutions lower the formation energy relative to pristine; the Pr cell stays </w:t>
       </w:r>
       <w:r>
         <w:rPr>
@@ -6584,7 +6591,7 @@
                 <w:rFonts w:asciiTheme="majorBidi" w:hAnsiTheme="majorBidi" w:cstheme="majorBidi"/>
                 <w:vertAlign w:val="superscript"/>
               </w:rPr>
-              <w:t>f</w:t>
+              <w:t>a</w:t>
             </w:r>
           </w:p>
         </w:tc>
@@ -6740,7 +6747,7 @@
                 <w:rFonts w:asciiTheme="majorBidi" w:hAnsiTheme="majorBidi" w:cstheme="majorBidi"/>
                 <w:vertAlign w:val="superscript"/>
               </w:rPr>
-              <w:t>c</w:t>
+              <w:t>b</w:t>
             </w:r>
           </w:p>
         </w:tc>
@@ -6878,7 +6885,7 @@
                 <w:rFonts w:asciiTheme="majorBidi" w:hAnsiTheme="majorBidi" w:cstheme="majorBidi"/>
                 <w:vertAlign w:val="superscript"/>
               </w:rPr>
-              <w:t>e</w:t>
+              <w:t>c</w:t>
             </w:r>
           </w:p>
         </w:tc>
@@ -7013,7 +7020,14 @@
                 <w:rFonts w:asciiTheme="majorBidi" w:hAnsiTheme="majorBidi" w:cstheme="majorBidi"/>
               </w:rPr>
               <w:lastRenderedPageBreak/>
-              <w:t>magnetic at 0.002 Ry e</w:t>
+              <w:t xml:space="preserve">magnetic at 0.002 Ry </w:t>
+            </w:r>
+            <w:r>
+              <w:rPr>
+                <w:rFonts w:asciiTheme="majorBidi" w:hAnsiTheme="majorBidi" w:cstheme="majorBidi"/>
+                <w:vertAlign w:val="superscript"/>
+              </w:rPr>
+              <w:t xml:space="preserve">c</w:t>
             </w:r>
           </w:p>
         </w:tc>
@@ -7438,7 +7452,7 @@
           <w:iCs/>
           <w:vertAlign w:val="superscript"/>
         </w:rPr>
-        <w:t>c</w:t>
+        <w:t>a</w:t>
       </w:r>
       <w:r>
         <w:rPr>
@@ -7446,7 +7460,24 @@
           <w:i/>
           <w:iCs/>
         </w:rPr>
-        <w:t xml:space="preserve"> Triplet reached from a start of 0.05 on Ti and O (Section S1); no singlet trial was performed. </w:t>
+        <w:t xml:space="preserve"> Unrelaxed single point (run 1); the relaxed cell (run 47) prints 8.87 eV, the difference showing that the printed E</w:t>
+      </w:r>
+      <w:r>
+        <w:rPr>
+          <w:rFonts w:asciiTheme="majorBidi" w:hAnsiTheme="majorBidi" w:cstheme="majorBidi"/>
+          <w:i/>
+          <w:iCs/>
+          <w:vertAlign w:val="subscript"/>
+        </w:rPr>
+        <w:t>F</w:t>
+      </w:r>
+      <w:r>
+        <w:rPr>
+          <w:rFonts w:asciiTheme="majorBidi" w:hAnsiTheme="majorBidi" w:cstheme="majorBidi"/>
+          <w:i/>
+          <w:iCs/>
+        </w:rPr>
+        <w:t xml:space="preserve"> of the insulating cell is not a physical level (Section 3.6). </w:t>
       </w:r>
       <w:r>
         <w:rPr>
@@ -7455,7 +7486,7 @@
           <w:iCs/>
           <w:vertAlign w:val="superscript"/>
         </w:rPr>
-        <w:t>e</w:t>
+        <w:t>b</w:t>
       </w:r>
       <w:r>
         <w:rPr>
@@ -7463,24 +7494,7 @@
           <w:i/>
           <w:iCs/>
         </w:rPr>
-        <w:t xml:space="preserve"> Lowest solution with narrower smearing (Section 3.3, Table S11): |m| = 1.00 μ</w:t>
-      </w:r>
-      <w:r>
-        <w:rPr>
-          <w:rFonts w:asciiTheme="majorBidi" w:hAnsiTheme="majorBidi" w:cstheme="majorBidi"/>
-          <w:i/>
-          <w:iCs/>
-          <w:vertAlign w:val="subscript"/>
-        </w:rPr>
-        <w:t>B</w:t>
-      </w:r>
-      <w:r>
-        <w:rPr>
-          <w:rFonts w:asciiTheme="majorBidi" w:hAnsiTheme="majorBidi" w:cstheme="majorBidi"/>
-          <w:i/>
-          <w:iCs/>
-        </w:rPr>
-        <w:t xml:space="preserve"> in both Pr cells; the magnetic trial at 0.01 Ry lies +0.28 to +0.39 eV above the non-magnetic Pr_VO solution. </w:t>
+        <w:t xml:space="preserve"> Triplet reached from a start of 0.05 on Ti and O (Section S1); no singlet trial was performed. </w:t>
       </w:r>
       <w:r>
         <w:rPr>
@@ -7489,7 +7503,7 @@
           <w:iCs/>
           <w:vertAlign w:val="superscript"/>
         </w:rPr>
-        <w:t>f</w:t>
+        <w:t>c</w:t>
       </w:r>
       <w:r>
         <w:rPr>
@@ -7497,7 +7511,7 @@
           <w:i/>
           <w:iCs/>
         </w:rPr>
-        <w:t xml:space="preserve"> Unrelaxed single point (run 1); the relaxed cell (run 47) prints 8.87 eV, the difference showing that the printed E</w:t>
+        <w:t xml:space="preserve"> Lowest solution with narrower smearing (Section 3.3, Table S11): |m| = 1.00 μ</w:t>
       </w:r>
       <w:r>
         <w:rPr>
@@ -7506,7 +7520,7 @@
           <w:iCs/>
           <w:vertAlign w:val="subscript"/>
         </w:rPr>
-        <w:t>F</w:t>
+        <w:t>B</w:t>
       </w:r>
       <w:r>
         <w:rPr>
@@ -7514,7 +7528,7 @@
           <w:i/>
           <w:iCs/>
         </w:rPr>
-        <w:t xml:space="preserve"> of the insulating cell is not a physical level (Section 3.6).</w:t>
+        <w:t xml:space="preserve"> in both Pr cells; the magnetic trial at 0.01 Ry lies +0.28 to +0.39 eV above the non-magnetic Pr_VO solution.</w:t>
       </w:r>
     </w:p>
     <w:p>
@@ -9509,7 +9523,7 @@
         <w:rPr>
           <w:rFonts w:asciiTheme="majorBidi" w:hAnsiTheme="majorBidi" w:cstheme="majorBidi"/>
         </w:rPr>
-        <w:t xml:space="preserve"> = +4.95 eV against the 2×2×2 pristine perfect cell, a shift of +0.20 eV, so a complete cycle now exists at 2×2×2 for all three hosts. Plane-wave cut-off. Single points at 40/320, 55/440 and 70/560 Ry on the production geometries of the four doped cells, with O</w:t>
+        <w:t xml:space="preserve"> = +4.95 eV against the 2×2×2 pristine perfect cell, a shift of +0.20 eV. Plane-wave cut-off. Single points at 40/320, 55/440 and 70/560 Ry on the production geometries of the four doped cells, with O</w:t>
       </w:r>
       <w:r>
         <w:rPr>
@@ -9921,7 +9935,7 @@
         <w:rPr>
           <w:rFonts w:asciiTheme="majorBidi" w:hAnsiTheme="majorBidi" w:cstheme="majorBidi"/>
         </w:rPr>
-        <w:t xml:space="preserve"> reference error and any error common to the two doped hosts cancel in the contrast; the untested contributions would have to amount to several eV to change the sign of the Rb value (−4.06 eV) or to remove the contrast (5.36 eV), whereas the sign of the Pr value (+1.29 eV) and the reductions relative to the pristine host are more sensitive, and the relaxation of the pristine perfect cell changes them by only 9 meV (Section 2.6). Taken together, the settings that remain untested (k-mesh of the relaxations, residual forces, supercell size, spin search beyond the cases above) plausibly amount to a few tenths of an eV in each absolute formation energy and could alter the localisation descriptors; none of the tests performed changes the sign of either doped formation energy or reduces the contrast below 5.1 eV.</w:t>
+        <w:t xml:space="preserve"> reference error and any error common to the two doped hosts cancel in the contrast; the untested contributions would have to amount to several eV to change the sign of the Rb value (−4.06 eV) or to remove the contrast (5.36 eV), whereas the sign of the Pr value (+1.29 eV) and the reductions relative to the pristine host are more sensitive, and the relaxation of the pristine perfect cell changes them by only 9 meV (Section 2.6). Taken together, the settings that remain untested (k-mesh of the relaxations, residual forces, supercell size, the U(Ti-3d) dependence of the formation energies, spin search beyond the cases above) plausibly amount to a few tenths of an eV in each absolute formation energy and could alter the localisation descriptors; none of the tests performed changes the sign of either doped formation energy or reduces the contrast below 5.1 eV.</w:t>
       </w:r>
     </w:p>
     <w:p>
@@ -11112,6 +11126,26 @@
           <w:rFonts w:asciiTheme="majorBidi" w:hAnsiTheme="majorBidi" w:cstheme="majorBidi"/>
         </w:rPr>
         <w:t xml:space="preserve"> No surface, interface, transition-level, capture-coefficient or device calculation is reported; statements about electron-transport layers are hypotheses.</w:t>
+      </w:r>
+      <w:r>
+        <w:rPr>
+          <w:rFonts w:asciiTheme="majorBidi" w:hAnsiTheme="majorBidi" w:cstheme="majorBidi"/>
+        </w:rPr>
+        <w:t xml:space="preserve"> (xv) </w:t>
+      </w:r>
+      <w:r>
+        <w:rPr>
+          <w:rFonts w:asciiTheme="majorBidi" w:hAnsiTheme="majorBidi" w:cstheme="majorBidi"/>
+          <w:i/>
+          <w:iCs/>
+        </w:rPr>
+        <w:t xml:space="preserve">Hubbard U and formation energies.</w:t>
+      </w:r>
+      <w:r>
+        <w:rPr>
+          <w:rFonts w:asciiTheme="majorBidi" w:hAnsiTheme="majorBidi" w:cstheme="majorBidi"/>
+        </w:rPr>
+        <w:t xml:space="preserve"> The U(Ti-3d) sweep (3.0–4.5 eV) consisted of single points on Pristine_perfect, Pr_VO and Rb_VO only; Pr_perfect and Rb_perfect were not recomputed, so the U dependence of the formation energies and of their Pr–Rb contrast is unknown. Because the net excess electron of Pr_VO occupies Ti-3d states whereas the vacancy electrons in the Rb cell fill O-2p holes, the Ti-3d Hubbard energy need not cancel in the contrast.</w:t>
       </w:r>
     </w:p>
     <w:p>

</xml_diff>

<commit_message>
Upload set: final-check fixes (footnote order, 5.11 rounding note, SI labels, cover-letter line breaks)
Co-Authored-By: Claude Opus 5.5 <noreply@anthropic.com>
Claude-Session: https://claude.ai/code/session_011m1nWiFCs4xdp8CXy2DSzu
</commit_message>
<xml_diff>
--- a/DFT_paper_revision/USER_19OCT_FIGFIX/2_Manuscript_Fig1-2_fixed.docx
+++ b/DFT_paper_revision/USER_19OCT_FIGFIX/2_Manuscript_Fig1-2_fixed.docx
@@ -4563,7 +4563,7 @@
           <w:iCs/>
         </w:rPr>
         <w:lastRenderedPageBreak/>
-        <w:t>(Pr) and −0.14 eV (Rb); the Pr–Rb difference shifts by +0.04 eV. The 2×2×2 Pr_VO and Rb_VO energies are runs of the k-mesh series (Table S2a), and the 2×2×2 formation-energy cycles are given in Table S2b, which start from scratch and therefore include small offsets from the relaxation endpoints (Section 3.7). Without the smearing entropy the values are +1.22 and −4.11 eV (Section 2.4); at 70 Ry they change by at most 0.03 eV (Section 3.7). With narrower smearing the lowest-energy Pr solutions are spin-polarised, and E</w:t>
+        <w:t>(Pr) and −0.14 eV (Rb); the Pr–Rb difference shifts by +0.04 eV. The 2×2×2 Pr_VO and Rb_VO energies are runs of the k-mesh series (Table S2a), which start from scratch and therefore include small offsets from the relaxation endpoints (Section 3.7); the 2×2×2 formation-energy cycles are given in Table S2b. Without the smearing entropy the values are +1.22 and −4.11 eV (Section 2.4); at 70 Ry they change by at most 0.03 eV (Section 3.7). With narrower smearing the lowest-energy Pr solutions are spin-polarised, and E</w:t>
       </w:r>
       <w:r>
         <w:rPr>
@@ -4876,7 +4876,7 @@
                 <w:rFonts w:asciiTheme="majorBidi" w:hAnsiTheme="majorBidi" w:cstheme="majorBidi"/>
                 <w:vertAlign w:val="superscript"/>
               </w:rPr>
-              <w:t xml:space="preserve">b</w:t>
+              <w:t xml:space="preserve">a</w:t>
             </w:r>
           </w:p>
         </w:tc>
@@ -4967,7 +4967,7 @@
                 <w:rFonts w:asciiTheme="majorBidi" w:hAnsiTheme="majorBidi" w:cstheme="majorBidi"/>
                 <w:vertAlign w:val="superscript"/>
               </w:rPr>
-              <w:t>a</w:t>
+              <w:t>b</w:t>
             </w:r>
           </w:p>
         </w:tc>
@@ -5392,7 +5392,7 @@
           <w:i/>
           <w:iCs/>
         </w:rPr>
-        <w:t xml:space="preserve"> The 2×2×2 pristine value uses the single point of the unrelaxed pristine perfect cell (Table S2a), whose relaxation energy at Γ is −9 meV. </w:t>
+        <w:t xml:space="preserve"> Relaxed in this work (Section 2.6); the single point on unrelaxed positions gives +4.74 eV. </w:t>
       </w:r>
       <w:r>
         <w:rPr>
@@ -5409,7 +5409,7 @@
           <w:i/>
           <w:iCs/>
         </w:rPr>
-        <w:t xml:space="preserve"> Relaxed in this work (Section 2.6); the single point on unrelaxed positions gives +4.74 eV.</w:t>
+        <w:t xml:space="preserve"> The 2×2×2 pristine value uses the single point of the unrelaxed pristine perfect cell (Table S2a), whose relaxation energy at Γ is −9 meV.</w:t>
       </w:r>
     </w:p>
     <w:p>
@@ -5813,7 +5813,7 @@
           <w:rFonts w:asciiTheme="majorBidi" w:hAnsiTheme="majorBidi" w:cstheme="majorBidi"/>
         </w:rPr>
         <w:lastRenderedPageBreak/>
-        <w:t>the contrast becomes 5.11 eV (Table S11). For the non-magnetic Pr_VO solution the projected densities of states (Section 3.6) show that the net excess electron occupies Ti-3d conduction-band states with no gap state; because the non-self-consistent run inherits the m = 0 density, its equal spin channels and zero site moments follow by construction and do not test the spin state. The occupation numbers near E</w:t>
+        <w:t>the contrast becomes 5.11 eV (5.113 eV from the unrounded totals; Table S11). For the non-magnetic Pr_VO solution the projected densities of states (Section 3.6) show that the net excess electron occupies Ti-3d conduction-band states with no gap state; because the non-self-consistent run inherits the m = 0 density, its equal spin channels and zero site moments follow by construction and do not test the spin state. The occupation numbers near E</w:t>
       </w:r>
       <w:r>
         <w:rPr>

</xml_diff>

<commit_message>
One colour key across all figures: Ti blue, O red, Pr orange, Rb green
Figure 1 (v6), Figure 3 (v6, bars by cell), Figure 4 and SI Figures S1/S2 (v5),
graphical abstract; captions in the upload copies updated to match. O red
#b2182b chosen so it stays distinct from Pr orange (palette check passes for
blue/red/orange/green, all pairs). Masters unchanged.

Co-Authored-By: Claude Opus 5.5 <noreply@anthropic.com>
Claude-Session: https://claude.ai/code/session_011m1nWiFCs4xdp8CXy2DSzu
</commit_message>
<xml_diff>
--- a/DFT_paper_revision/USER_19OCT_FIGFIX/2_Manuscript_Fig1-2_fixed.docx
+++ b/DFT_paper_revision/USER_19OCT_FIGFIX/2_Manuscript_Fig1-2_fixed.docx
@@ -4309,7 +4309,7 @@
           <w:i/>
           <w:iCs/>
         </w:rPr>
-        <w:t xml:space="preserve"> The (010) atomic plane containing the dopant site and the oxygen vacancy. (a) Ideal anatase positions built with the lattice parameters of this work (a = 7.63632 Å, c = 9.77900 Å, u = 0.208), with the dopant on the substituted Ti site and the vacant oxygen site marked by a dashed circle. (b) The same plane in the relaxed Rb_VO cell (PBE+U, U(Ti-3d) = 3.5 eV, Γ-only), from the final coordinates of the production relaxation. Arrows give the displacement (where larger than 0.2 Å) of each in-plane atom from its ideal site after removal of the mean displacement; the dotted circle marks the ideal Rb site. The oxygen drawn in blue (O8) carries the largest Löwdin spin polarisation (+0.59 μ</w:t>
+        <w:t xml:space="preserve"> The (010) atomic plane containing the dopant site and the oxygen vacancy. (a) Ideal anatase positions built with the lattice parameters of this work (a = 7.63632 Å, c = 9.77900 Å, u = 0.208), with the dopant on the substituted Ti site and the vacant oxygen site marked by a dashed circle. (b) The same plane in the relaxed Rb_VO cell (PBE+U, U(Ti-3d) = 3.5 eV, Γ-only), from the final coordinates of the production relaxation. Arrows give the displacement (where larger than 0.2 Å) of each in-plane atom from its ideal site after removal of the mean displacement; the dotted circle marks the ideal Rb site. The oxygen with the yellow ring (O8) carries the largest Löwdin spin polarisation (+0.59 μ</w:t>
       </w:r>
       <w:r>
         <w:rPr>
@@ -4326,7 +4326,7 @@
           <w:i/>
           <w:iCs/>
         </w:rPr>
-        <w:t>; Section 3.6, Figure S1). Grey: Ti; red: O; green: Rb. Only atoms in the plane are drawn, so each Ti shows fewer than six bonds. Plotted from the pw.x output by figures/make_fig1_structures.py.</w:t>
+        <w:t>; Section 3.6, Figure S1). Blue: Ti; red: O; green: Rb. Only atoms in the plane are drawn, so each Ti shows fewer than six bonds. Plotted from the pw.x output by figures/make_fig1_structures.py.</w:t>
       </w:r>
     </w:p>
     <w:p>
@@ -9262,7 +9262,7 @@
           <w:i/>
           <w:iCs/>
         </w:rPr>
-        <w:t>, from 2×2×2 non-self-consistent calculations on the relaxed cells (PBE+U, U(Ti-3d) = 3.5 eV; tetrahedron occupations; Gaussian broadening 0.01 Ry). Spin up is plotted upwards and spin down downwards; energies are relative to each cell’s Fermi level (10.31 and 7.14 eV). Filled blue: Ti-3d summed over 15 Ti; orange: O-2p summed over 31 O; green: Pr-5d multiplied by 5; grey: total. The Rb dataset has no d projector, so no dopant-d channel exists for Rb_VO. In (b) the occupied conduction-band states have equal weight in the two spin channels, as the m = 0 density implies (95 % Ti-3d; the broadened DOS holds 0.70 states per channel between −0.6 eV and E</w:t>
+        <w:t>, from 2×2×2 non-self-consistent calculations on the relaxed cells (PBE+U, U(Ti-3d) = 3.5 eV; tetrahedron occupations; Gaussian broadening 0.01 Ry). Spin up is plotted upwards and spin down downwards; energies are relative to each cell’s Fermi level (10.31 and 7.14 eV). Filled blue: Ti-3d summed over 15 Ti; red: O-2p summed over 31 O; orange (dashed): Pr-5d multiplied by 5; grey: total. The Rb dataset has no d projector, so no dopant-d channel exists for Rb_VO. In (b) the occupied conduction-band states have equal weight in the two spin channels, as the m = 0 density implies (95 % Ti-3d; the broadened DOS holds 0.70 states per channel between −0.6 eV and E</w:t>
       </w:r>
       <w:r>
         <w:rPr>

</xml_diff>

<commit_message>
Figure 2 in the author's reference style; extra values moved to its caption
Bars, values and the Pr-Rb contrast arrow only; 2x2x2 and narrower-smearing
values stated in the caption of the upload copy. Masters unchanged.

Co-Authored-By: Claude Opus 5.5 <noreply@anthropic.com>
Claude-Session: https://claude.ai/code/session_011m1nWiFCs4xdp8CXy2DSzu
</commit_message>
<xml_diff>
--- a/DFT_paper_revision/USER_19OCT_FIGFIX/2_Manuscript_Fig1-2_fixed.docx
+++ b/DFT_paper_revision/USER_19OCT_FIGFIX/2_Manuscript_Fig1-2_fixed.docx
@@ -5516,7 +5516,7 @@
           <w:i/>
           <w:iCs/>
         </w:rPr>
-        <w:t xml:space="preserve">) for pristine, Pr-substituted and Rb-substituted anatase (PBE+U, U(Ti-3d) = 3.5 eV). Bars: Γ-only relaxed cells (this work; Table 2). Dashed ticks: single-point values at 2×2×2 on the Γ geometries of the doped cells (pristine: +4.95 eV, Table 2). Both substitutions lower the formation energy relative to pristine; the Pr cell stays </w:t>
+        <w:t xml:space="preserve">) for pristine, Pr-substituted and Rb-substituted anatase (PBE+U, U(Ti-3d) = 3.5 eV). Bars: Γ-only relaxed cells (Table 2); the arrow marks the Pr–Rb contrast, Δ = 5.36 eV. Both substitutions lower the formation energy relative to pristine; the Pr cell stays </w:t>
       </w:r>
       <w:r>
         <w:rPr>
@@ -5525,7 +5525,7 @@
           <w:iCs/>
         </w:rPr>
         <w:lastRenderedPageBreak/>
-        <w:t>positive and the Rb cell becomes negative. Open diamonds: the lowest-energy spin solutions with narrower smearing (σ → 0 estimate; Section 3.3).</w:t>
+        <w:t>positive and the Rb cell becomes negative. Single points at 2×2×2 on the Γ geometries give +1.19 eV (Pr) and −4.20 eV (Rb), and +4.95 eV for pristine on the unrelaxed perfect cell (Table 2); with narrower smearing the lowest-energy spin solutions give +0.99 eV (Pr) and −4.13 eV (Rb) (σ → 0 estimates; Section 3.3, Table S11).</w:t>
       </w:r>
     </w:p>
     <w:p>

</xml_diff>

<commit_message>
Figures 3, 4, S1, S2: no legends or in-plot notes; keys stated in the captions
Co-Authored-By: Claude Opus 5.5 <noreply@anthropic.com>
Claude-Session: https://claude.ai/code/session_011m1nWiFCs4xdp8CXy2DSzu
</commit_message>
<xml_diff>
--- a/DFT_paper_revision/USER_19OCT_FIGFIX/2_Manuscript_Fig1-2_fixed.docx
+++ b/DFT_paper_revision/USER_19OCT_FIGFIX/2_Manuscript_Fig1-2_fixed.docx
@@ -7635,7 +7635,7 @@
           <w:i/>
           <w:iCs/>
         </w:rPr>
-        <w:t xml:space="preserve"> reference (PBE+U relaxations with U on Ti-3d only). At the production smearing of 0.01 Ry the Pr cells and the pristine perfect cell converge to non-magnetic solutions; both Rb cells carry one unpaired spin with m</w:t>
+        <w:t xml:space="preserve"> reference (PBE+U relaxations with U on Ti-3d only). Solid bars: |m|; hatched bars: absolute magnetisation. At the production smearing of 0.01 Ry the Pr cells and the pristine perfect cell converge to non-magnetic solutions; both Rb cells carry one unpaired spin with m</w:t>
       </w:r>
       <w:r>
         <w:rPr>
@@ -9190,7 +9190,7 @@
         <w:lastRenderedPageBreak/>
         <w:drawing>
           <wp:inline distT="0" distB="0" distL="0" distR="0" wp14:anchorId="56AED506" wp14:editId="0C2F375A">
-            <wp:extent cx="5334000" cy="4510667"/>
+            <wp:extent cx="5334000" cy="4628562"/>
             <wp:effectExtent l="0" t="0" r="0" b="0"/>
             <wp:docPr id="30" name="Picture"/>
             <wp:cNvGraphicFramePr/>
@@ -9212,7 +9212,7 @@
                   <pic:spPr bwMode="auto">
                     <a:xfrm>
                       <a:off x="0" y="0"/>
-                      <a:ext cx="5334000" cy="4510667"/>
+                      <a:ext cx="5334000" cy="4628562"/>
                     </a:xfrm>
                     <a:prstGeom prst="rect">
                       <a:avLst/>

</xml_diff>

<commit_message>
Final figure check: yellow O8 ring, one Ti blue, E_F line in captions, alt text
Co-Authored-By: Claude Opus 5.5 <noreply@anthropic.com>
Claude-Session: https://claude.ai/code/session_011m1nWiFCs4xdp8CXy2DSzu
</commit_message>
<xml_diff>
--- a/DFT_paper_revision/USER_19OCT_FIGFIX/2_Manuscript_Fig1-2_fixed.docx
+++ b/DFT_paper_revision/USER_19OCT_FIGFIX/2_Manuscript_Fig1-2_fixed.docx
@@ -4254,7 +4254,7 @@
               <a:graphicData uri="http://schemas.openxmlformats.org/drawingml/2006/picture">
                 <pic:pic xmlns:pic="http://schemas.openxmlformats.org/drawingml/2006/picture">
                   <pic:nvPicPr>
-                    <pic:cNvPr id="22" name="Picture" descr="../figures/Fig1_structures_v4.png"/>
+                    <pic:cNvPr id="22" name="Picture" descr="Figure 1. The (010) plane through the dopant site: ideal anatase and relaxed Rb_VO"/>
                     <pic:cNvPicPr>
                       <a:picLocks noChangeAspect="1" noChangeArrowheads="1"/>
                     </pic:cNvPicPr>
@@ -5435,7 +5435,7 @@
               <a:graphicData uri="http://schemas.openxmlformats.org/drawingml/2006/picture">
                 <pic:pic xmlns:pic="http://schemas.openxmlformats.org/drawingml/2006/picture">
                   <pic:nvPicPr>
-                    <pic:cNvPr id="25" name="Picture" descr="../figures/Fig2_formation_energies_v4.png"/>
+                    <pic:cNvPr id="25" name="Picture" descr="Figure 2. Neutral oxygen-vacancy formation energies of pristine, Pr- and Rb-substituted anatase"/>
                     <pic:cNvPicPr>
                       <a:picLocks noChangeAspect="1" noChangeArrowheads="1"/>
                     </pic:cNvPicPr>
@@ -7554,7 +7554,7 @@
               <a:graphicData uri="http://schemas.openxmlformats.org/drawingml/2006/picture">
                 <pic:pic xmlns:pic="http://schemas.openxmlformats.org/drawingml/2006/picture">
                   <pic:nvPicPr>
-                    <pic:cNvPr id="28" name="Picture" descr="../figures/Fig3_magnetisation_v4.png"/>
+                    <pic:cNvPr id="28" name="Picture" descr="Figure 3. Total and absolute magnetisation of the production cells"/>
                     <pic:cNvPicPr>
                       <a:picLocks noChangeAspect="1" noChangeArrowheads="1"/>
                     </pic:cNvPicPr>
@@ -9198,7 +9198,7 @@
               <a:graphicData uri="http://schemas.openxmlformats.org/drawingml/2006/picture">
                 <pic:pic xmlns:pic="http://schemas.openxmlformats.org/drawingml/2006/picture">
                   <pic:nvPicPr>
-                    <pic:cNvPr id="31" name="Picture" descr="../figures/Fig4_PDOS_v4.png"/>
+                    <pic:cNvPr id="31" name="Picture" descr="Figure 4. Spin-resolved projected densities of states of Pr_VO and Rb_VO"/>
                     <pic:cNvPicPr>
                       <a:picLocks noChangeAspect="1" noChangeArrowheads="1"/>
                     </pic:cNvPicPr>
@@ -9262,7 +9262,7 @@
           <w:i/>
           <w:iCs/>
         </w:rPr>
-        <w:t>, from 2×2×2 non-self-consistent calculations on the relaxed cells (PBE+U, U(Ti-3d) = 3.5 eV; tetrahedron occupations; Gaussian broadening 0.01 Ry). Spin up is plotted upwards and spin down downwards; energies are relative to each cell’s Fermi level (10.31 and 7.14 eV). Filled blue: Ti-3d summed over 15 Ti; red: O-2p summed over 31 O; orange (dashed): Pr-5d multiplied by 5; grey: total. The Rb dataset has no d projector, so no dopant-d channel exists for Rb_VO. In (b) the occupied conduction-band states have equal weight in the two spin channels, as the m = 0 density implies (95 % Ti-3d; the broadened DOS holds 0.70 states per channel between −0.6 eV and E</w:t>
+        <w:t>, from 2×2×2 non-self-consistent calculations on the relaxed cells (PBE+U, U(Ti-3d) = 3.5 eV; tetrahedron occupations; Gaussian broadening 0.01 Ry). Spin up is plotted upwards and spin down downwards; energies are relative to each cell’s Fermi level (10.31 and 7.14 eV), marked by the dashed vertical line. Filled blue: Ti-3d summed over 15 Ti; red: O-2p summed over 31 O; orange (dashed): Pr-5d multiplied by 5; grey: total. The Rb dataset has no d projector, so no dopant-d channel exists for Rb_VO. In (b) the occupied conduction-band states have equal weight in the two spin channels, as the m = 0 density implies (95 % Ti-3d; the broadened DOS holds 0.70 states per channel between −0.6 eV and E</w:t>
       </w:r>
       <w:r>
         <w:rPr>

</xml_diff>